<commit_message>
Trying to update Docx
</commit_message>
<xml_diff>
--- a/Week4/Stage_1_SmartCare_v01_and_AI_Activity_Card.docx
+++ b/Week4/Stage_1_SmartCare_v01_and_AI_Activity_Card.docx
@@ -53,7 +53,171 @@
         <w:t xml:space="preserve">The client </w:t>
       </w:r>
       <w:r>
-        <w:t xml:space="preserve">has requested a software application that can assist patients, and practitioners in the scheduling and cancellation of appointments, and in </w:t>
+        <w:t>has requested a software application that can</w:t>
+      </w:r>
+      <w:r>
+        <w:t xml:space="preserve"> initially</w:t>
+      </w:r>
+      <w:r>
+        <w:t xml:space="preserve"> assist </w:t>
+      </w:r>
+      <w:r>
+        <w:t>patients</w:t>
+      </w:r>
+      <w:r>
+        <w:t xml:space="preserve"> and practitioners </w:t>
+      </w:r>
+      <w:r>
+        <w:t>with</w:t>
+      </w:r>
+      <w:r>
+        <w:t xml:space="preserve"> the problems specified</w:t>
+      </w:r>
+      <w:r>
+        <w:t>, while not creating a large-scale software application.</w:t>
+      </w:r>
+      <w:r>
+        <w:t xml:space="preserve"> </w:t>
+      </w:r>
+      <w:r>
+        <w:t>The issues</w:t>
+      </w:r>
+      <w:r>
+        <w:t xml:space="preserve"> are:</w:t>
+      </w:r>
+    </w:p>
+    <w:p>
+      <w:r>
+        <w:t>“</w:t>
+      </w:r>
+    </w:p>
+    <w:p>
+      <w:pPr>
+        <w:pStyle w:val="ListParagraph"/>
+        <w:numPr>
+          <w:ilvl w:val="0"/>
+          <w:numId w:val="10"/>
+        </w:numPr>
+      </w:pPr>
+      <w:r>
+        <w:t>D</w:t>
+      </w:r>
+      <w:r>
+        <w:t>uplicate appointment bookings</w:t>
+      </w:r>
+    </w:p>
+    <w:p>
+      <w:pPr>
+        <w:pStyle w:val="ListParagraph"/>
+        <w:numPr>
+          <w:ilvl w:val="0"/>
+          <w:numId w:val="10"/>
+        </w:numPr>
+      </w:pPr>
+      <w:r>
+        <w:t>Difficulty locating patient records</w:t>
+      </w:r>
+    </w:p>
+    <w:p>
+      <w:pPr>
+        <w:pStyle w:val="ListParagraph"/>
+        <w:numPr>
+          <w:ilvl w:val="0"/>
+          <w:numId w:val="10"/>
+        </w:numPr>
+      </w:pPr>
+      <w:r>
+        <w:t>Inconsistent appointment status information</w:t>
+      </w:r>
+    </w:p>
+    <w:p>
+      <w:pPr>
+        <w:pStyle w:val="ListParagraph"/>
+        <w:numPr>
+          <w:ilvl w:val="0"/>
+          <w:numId w:val="10"/>
+        </w:numPr>
+      </w:pPr>
+      <w:r>
+        <w:t>Limited visibility of practitioner availability</w:t>
+      </w:r>
+    </w:p>
+    <w:p>
+      <w:pPr>
+        <w:pStyle w:val="ListParagraph"/>
+        <w:numPr>
+          <w:ilvl w:val="0"/>
+          <w:numId w:val="10"/>
+        </w:numPr>
+      </w:pPr>
+      <w:r>
+        <w:t>Manual cancellation process</w:t>
+      </w:r>
+    </w:p>
+    <w:p>
+      <w:pPr>
+        <w:pStyle w:val="ListParagraph"/>
+        <w:numPr>
+          <w:ilvl w:val="0"/>
+          <w:numId w:val="10"/>
+        </w:numPr>
+      </w:pPr>
+      <w:r>
+        <w:t>Lack of reliable appointment history</w:t>
+      </w:r>
+    </w:p>
+    <w:p>
+      <w:pPr>
+        <w:pStyle w:val="ListParagraph"/>
+        <w:numPr>
+          <w:ilvl w:val="0"/>
+          <w:numId w:val="10"/>
+        </w:numPr>
+      </w:pPr>
+      <w:r>
+        <w:t>Difficulty producing basic operational reports</w:t>
+      </w:r>
+      <w:r>
+        <w:t>.</w:t>
+      </w:r>
+      <w:r>
+        <w:t xml:space="preserve"> </w:t>
+      </w:r>
+    </w:p>
+    <w:p>
+      <w:proofErr w:type="gramStart"/>
+      <w:r>
+        <w:t>“ (</w:t>
+      </w:r>
+      <w:proofErr w:type="gramEnd"/>
+      <w:r>
+        <w:t>SmartCare, 2026)</w:t>
+      </w:r>
+    </w:p>
+    <w:p>
+      <w:pPr>
+        <w:ind w:left="360"/>
+      </w:pPr>
+      <w:r>
+        <w:t xml:space="preserve">These issues can be simplified </w:t>
+      </w:r>
+      <w:r>
+        <w:t>into</w:t>
+      </w:r>
+      <w:r>
+        <w:t xml:space="preserve"> four main issues, which are </w:t>
+      </w:r>
+      <w:r>
+        <w:t xml:space="preserve">all different subsystems in the software. </w:t>
+      </w:r>
+      <w:r>
+        <w:t xml:space="preserve">The different </w:t>
+      </w:r>
+      <w:r>
+        <w:t>subsystems</w:t>
+      </w:r>
+      <w:r>
+        <w:t xml:space="preserve"> to create are the Appointment Scheduling, the Cancellation of Appointments, The Operational Reports Generating, and the assist in locating patient records.</w:t>
       </w:r>
     </w:p>
     <w:p>
@@ -101,13 +265,21 @@
           <w:tcPr>
             <w:tcW w:w="5040" w:type="dxa"/>
           </w:tcPr>
-          <w:p/>
+          <w:p>
+            <w:r>
+              <w:t>Management</w:t>
+            </w:r>
+          </w:p>
         </w:tc>
         <w:tc>
           <w:tcPr>
             <w:tcW w:w="5040" w:type="dxa"/>
           </w:tcPr>
-          <w:p/>
+          <w:p>
+            <w:r>
+              <w:t xml:space="preserve">Simple software system to initially support the patient, practitioner, and appointment management. </w:t>
+            </w:r>
+          </w:p>
         </w:tc>
       </w:tr>
       <w:tr>
@@ -115,13 +287,21 @@
           <w:tcPr>
             <w:tcW w:w="5040" w:type="dxa"/>
           </w:tcPr>
-          <w:p/>
+          <w:p>
+            <w:r>
+              <w:t>Organisation</w:t>
+            </w:r>
+          </w:p>
         </w:tc>
         <w:tc>
           <w:tcPr>
             <w:tcW w:w="5040" w:type="dxa"/>
           </w:tcPr>
-          <w:p/>
+          <w:p>
+            <w:r>
+              <w:t xml:space="preserve">Not a complex hospital information system, able to be manageable for a small clinic. </w:t>
+            </w:r>
+          </w:p>
         </w:tc>
       </w:tr>
       <w:tr>
@@ -209,19 +389,31 @@
           <w:tcPr>
             <w:tcW w:w="3360" w:type="dxa"/>
           </w:tcPr>
-          <w:p/>
+          <w:p>
+            <w:r>
+              <w:t>Appointment Scheduling</w:t>
+            </w:r>
+          </w:p>
         </w:tc>
         <w:tc>
           <w:tcPr>
             <w:tcW w:w="3360" w:type="dxa"/>
           </w:tcPr>
-          <w:p/>
+          <w:p>
+            <w:r>
+              <w:t>Confirmed</w:t>
+            </w:r>
+          </w:p>
         </w:tc>
         <w:tc>
           <w:tcPr>
             <w:tcW w:w="3360" w:type="dxa"/>
           </w:tcPr>
-          <w:p/>
+          <w:p>
+            <w:r>
+              <w:t>The issue has been addressed by both the client and Management.</w:t>
+            </w:r>
+          </w:p>
         </w:tc>
       </w:tr>
       <w:tr>
@@ -229,19 +421,59 @@
           <w:tcPr>
             <w:tcW w:w="3360" w:type="dxa"/>
           </w:tcPr>
-          <w:p/>
+          <w:p>
+            <w:r>
+              <w:lastRenderedPageBreak/>
+              <w:t>Records and History Management</w:t>
+            </w:r>
+          </w:p>
         </w:tc>
         <w:tc>
           <w:tcPr>
             <w:tcW w:w="3360" w:type="dxa"/>
           </w:tcPr>
-          <w:p/>
+          <w:p>
+            <w:r>
+              <w:t>Provisional</w:t>
+            </w:r>
+          </w:p>
         </w:tc>
         <w:tc>
           <w:tcPr>
             <w:tcW w:w="3360" w:type="dxa"/>
           </w:tcPr>
-          <w:p/>
+          <w:p>
+            <w:r>
+              <w:t xml:space="preserve">This issue has </w:t>
+            </w:r>
+            <w:r>
+              <w:t xml:space="preserve">been </w:t>
+            </w:r>
+            <w:r>
+              <w:t xml:space="preserve">addressed as an important issue to </w:t>
+            </w:r>
+            <w:r>
+              <w:t>tackle;</w:t>
+            </w:r>
+            <w:r>
+              <w:t xml:space="preserve"> </w:t>
+            </w:r>
+            <w:r>
+              <w:t>however,</w:t>
+            </w:r>
+            <w:r>
+              <w:t xml:space="preserve"> the Organisation has </w:t>
+            </w:r>
+            <w:r>
+              <w:t>requested</w:t>
+            </w:r>
+            <w:r>
+              <w:t xml:space="preserve"> a simple system and not a complex hospital information system. T</w:t>
+            </w:r>
+            <w:r>
+              <w:t>his feature might be outside of the scope due to this.</w:t>
+            </w:r>
+          </w:p>
         </w:tc>
       </w:tr>
       <w:tr>
@@ -249,19 +481,31 @@
           <w:tcPr>
             <w:tcW w:w="3360" w:type="dxa"/>
           </w:tcPr>
-          <w:p/>
+          <w:p>
+            <w:r>
+              <w:t>Operational Report Generating</w:t>
+            </w:r>
+          </w:p>
         </w:tc>
         <w:tc>
           <w:tcPr>
             <w:tcW w:w="3360" w:type="dxa"/>
           </w:tcPr>
-          <w:p/>
+          <w:p>
+            <w:r>
+              <w:t>Provisional</w:t>
+            </w:r>
+          </w:p>
         </w:tc>
         <w:tc>
           <w:tcPr>
             <w:tcW w:w="3360" w:type="dxa"/>
           </w:tcPr>
-          <w:p/>
+          <w:p>
+            <w:r>
+              <w:t>This issue has only been addressed as an issue the clinic is experiencing, not as a request for implementation.</w:t>
+            </w:r>
+          </w:p>
         </w:tc>
       </w:tr>
       <w:tr>
@@ -269,19 +513,31 @@
           <w:tcPr>
             <w:tcW w:w="3360" w:type="dxa"/>
           </w:tcPr>
-          <w:p/>
+          <w:p>
+            <w:r>
+              <w:t>Cancellations of appointments</w:t>
+            </w:r>
+          </w:p>
         </w:tc>
         <w:tc>
           <w:tcPr>
             <w:tcW w:w="3360" w:type="dxa"/>
           </w:tcPr>
-          <w:p/>
+          <w:p>
+            <w:r>
+              <w:t>Confirmed</w:t>
+            </w:r>
+          </w:p>
         </w:tc>
         <w:tc>
           <w:tcPr>
             <w:tcW w:w="3360" w:type="dxa"/>
           </w:tcPr>
-          <w:p/>
+          <w:p>
+            <w:r>
+              <w:t>The issue has been addressed by both the client and Management</w:t>
+            </w:r>
+          </w:p>
         </w:tc>
       </w:tr>
     </w:tbl>
@@ -295,17 +551,26 @@
     </w:p>
     <w:p>
       <w:r>
-        <w:t>1. ______________________________________________________________</w:t>
+        <w:t xml:space="preserve">1. </w:t>
+      </w:r>
+      <w:r>
+        <w:t xml:space="preserve">Is the Records and History Management included within the scope of this project? </w:t>
       </w:r>
     </w:p>
     <w:p>
       <w:r>
-        <w:t>2. ______________________________________________________________</w:t>
+        <w:t xml:space="preserve">2. </w:t>
+      </w:r>
+      <w:r>
+        <w:t xml:space="preserve">How would you like the Records and History Management system to </w:t>
+      </w:r>
+      <w:r>
+        <w:t>operate to keep the system simple?</w:t>
       </w:r>
     </w:p>
     <w:p>
       <w:r>
-        <w:t>3. ______________________________________________________________</w:t>
+        <w:t xml:space="preserve">3. </w:t>
       </w:r>
     </w:p>
     <w:p>
@@ -338,7 +603,6 @@
     </w:p>
     <w:p>
       <w:r>
-        <w:lastRenderedPageBreak/>
         <w:t>3. ______________________________________________________________</w:t>
       </w:r>
     </w:p>
@@ -379,16 +643,34 @@
     </w:p>
     <w:p>
       <w:r>
-        <w:t>Act as a tutor. Explain this code and identify potential problems. Do not provide a complete replacement. Ask me questions that help me reason about the solution.</w:t>
+        <w:t xml:space="preserve">Act as a tutor. Explain this code and identify potential problems. Do not provide a complete replacement. Ask me questions that help </w:t>
+      </w:r>
+      <w:proofErr w:type="gramStart"/>
+      <w:r>
+        <w:t>me</w:t>
+      </w:r>
+      <w:proofErr w:type="gramEnd"/>
+      <w:r>
+        <w:t xml:space="preserve"> reason </w:t>
+      </w:r>
+      <w:proofErr w:type="gramStart"/>
+      <w:r>
+        <w:t>about</w:t>
+      </w:r>
+      <w:proofErr w:type="gramEnd"/>
+      <w:r>
+        <w:t xml:space="preserve"> the solution.</w:t>
       </w:r>
     </w:p>
     <w:p>
       <w:pPr>
         <w:pStyle w:val="Heading2"/>
       </w:pPr>
+      <w:proofErr w:type="gramStart"/>
       <w:r>
         <w:t>Evaluate</w:t>
       </w:r>
+      <w:proofErr w:type="gramEnd"/>
     </w:p>
     <w:tbl>
       <w:tblPr>
@@ -849,6 +1131,119 @@
       </w:rPr>
     </w:lvl>
   </w:abstractNum>
+  <w:abstractNum w:abstractNumId="9" w15:restartNumberingAfterBreak="0">
+    <w:nsid w:val="50CC6E0D"/>
+    <w:multiLevelType w:val="hybridMultilevel"/>
+    <w:tmpl w:val="CBEA79CC"/>
+    <w:lvl w:ilvl="0" w:tplc="5456C83A">
+      <w:start w:val="3"/>
+      <w:numFmt w:val="bullet"/>
+      <w:lvlText w:val="-"/>
+      <w:lvlJc w:val="left"/>
+      <w:pPr>
+        <w:ind w:left="720" w:hanging="360"/>
+      </w:pPr>
+      <w:rPr>
+        <w:rFonts w:ascii="Aptos" w:eastAsiaTheme="minorEastAsia" w:hAnsi="Aptos" w:cstheme="minorBidi" w:hint="default"/>
+      </w:rPr>
+    </w:lvl>
+    <w:lvl w:ilvl="1" w:tplc="0C090003" w:tentative="1">
+      <w:start w:val="1"/>
+      <w:numFmt w:val="bullet"/>
+      <w:lvlText w:val="o"/>
+      <w:lvlJc w:val="left"/>
+      <w:pPr>
+        <w:ind w:left="1440" w:hanging="360"/>
+      </w:pPr>
+      <w:rPr>
+        <w:rFonts w:ascii="Courier New" w:hAnsi="Courier New" w:cs="Courier New" w:hint="default"/>
+      </w:rPr>
+    </w:lvl>
+    <w:lvl w:ilvl="2" w:tplc="0C090005" w:tentative="1">
+      <w:start w:val="1"/>
+      <w:numFmt w:val="bullet"/>
+      <w:lvlText w:val=""/>
+      <w:lvlJc w:val="left"/>
+      <w:pPr>
+        <w:ind w:left="2160" w:hanging="360"/>
+      </w:pPr>
+      <w:rPr>
+        <w:rFonts w:ascii="Wingdings" w:hAnsi="Wingdings" w:hint="default"/>
+      </w:rPr>
+    </w:lvl>
+    <w:lvl w:ilvl="3" w:tplc="0C090001" w:tentative="1">
+      <w:start w:val="1"/>
+      <w:numFmt w:val="bullet"/>
+      <w:lvlText w:val=""/>
+      <w:lvlJc w:val="left"/>
+      <w:pPr>
+        <w:ind w:left="2880" w:hanging="360"/>
+      </w:pPr>
+      <w:rPr>
+        <w:rFonts w:ascii="Symbol" w:hAnsi="Symbol" w:hint="default"/>
+      </w:rPr>
+    </w:lvl>
+    <w:lvl w:ilvl="4" w:tplc="0C090003" w:tentative="1">
+      <w:start w:val="1"/>
+      <w:numFmt w:val="bullet"/>
+      <w:lvlText w:val="o"/>
+      <w:lvlJc w:val="left"/>
+      <w:pPr>
+        <w:ind w:left="3600" w:hanging="360"/>
+      </w:pPr>
+      <w:rPr>
+        <w:rFonts w:ascii="Courier New" w:hAnsi="Courier New" w:cs="Courier New" w:hint="default"/>
+      </w:rPr>
+    </w:lvl>
+    <w:lvl w:ilvl="5" w:tplc="0C090005" w:tentative="1">
+      <w:start w:val="1"/>
+      <w:numFmt w:val="bullet"/>
+      <w:lvlText w:val=""/>
+      <w:lvlJc w:val="left"/>
+      <w:pPr>
+        <w:ind w:left="4320" w:hanging="360"/>
+      </w:pPr>
+      <w:rPr>
+        <w:rFonts w:ascii="Wingdings" w:hAnsi="Wingdings" w:hint="default"/>
+      </w:rPr>
+    </w:lvl>
+    <w:lvl w:ilvl="6" w:tplc="0C090001" w:tentative="1">
+      <w:start w:val="1"/>
+      <w:numFmt w:val="bullet"/>
+      <w:lvlText w:val=""/>
+      <w:lvlJc w:val="left"/>
+      <w:pPr>
+        <w:ind w:left="5040" w:hanging="360"/>
+      </w:pPr>
+      <w:rPr>
+        <w:rFonts w:ascii="Symbol" w:hAnsi="Symbol" w:hint="default"/>
+      </w:rPr>
+    </w:lvl>
+    <w:lvl w:ilvl="7" w:tplc="0C090003" w:tentative="1">
+      <w:start w:val="1"/>
+      <w:numFmt w:val="bullet"/>
+      <w:lvlText w:val="o"/>
+      <w:lvlJc w:val="left"/>
+      <w:pPr>
+        <w:ind w:left="5760" w:hanging="360"/>
+      </w:pPr>
+      <w:rPr>
+        <w:rFonts w:ascii="Courier New" w:hAnsi="Courier New" w:cs="Courier New" w:hint="default"/>
+      </w:rPr>
+    </w:lvl>
+    <w:lvl w:ilvl="8" w:tplc="0C090005" w:tentative="1">
+      <w:start w:val="1"/>
+      <w:numFmt w:val="bullet"/>
+      <w:lvlText w:val=""/>
+      <w:lvlJc w:val="left"/>
+      <w:pPr>
+        <w:ind w:left="6480" w:hanging="360"/>
+      </w:pPr>
+      <w:rPr>
+        <w:rFonts w:ascii="Wingdings" w:hAnsi="Wingdings" w:hint="default"/>
+      </w:rPr>
+    </w:lvl>
+  </w:abstractNum>
   <w:num w:numId="1" w16cid:durableId="998272528">
     <w:abstractNumId w:val="8"/>
   </w:num>
@@ -875,6 +1270,9 @@
   </w:num>
   <w:num w:numId="9" w16cid:durableId="462889607">
     <w:abstractNumId w:val="0"/>
+  </w:num>
+  <w:num w:numId="10" w16cid:durableId="907887621">
+    <w:abstractNumId w:val="9"/>
   </w:num>
 </w:numbering>
 </file>

</xml_diff>

<commit_message>
Add Week 4 Work
</commit_message>
<xml_diff>
--- a/Week4/Stage_1_SmartCare_v01_and_AI_Activity_Card.docx
+++ b/Week4/Stage_1_SmartCare_v01_and_AI_Activity_Card.docx
@@ -100,10 +100,7 @@
         </w:numPr>
       </w:pPr>
       <w:r>
-        <w:t>D</w:t>
-      </w:r>
-      <w:r>
-        <w:t>uplicate appointment bookings</w:t>
+        <w:t>Duplicate appointment bookings</w:t>
       </w:r>
     </w:p>
     <w:p>
@@ -185,11 +182,12 @@
       </w:r>
     </w:p>
     <w:p>
-      <w:proofErr w:type="gramStart"/>
       <w:r>
-        <w:t>“ (</w:t>
+        <w:t xml:space="preserve"> </w:t>
       </w:r>
-      <w:proofErr w:type="gramEnd"/>
+      <w:r>
+        <w:t>“(</w:t>
+      </w:r>
       <w:r>
         <w:t>SmartCare, 2026)</w:t>
       </w:r>
@@ -444,10 +442,7 @@
           </w:tcPr>
           <w:p>
             <w:r>
-              <w:t xml:space="preserve">This issue has </w:t>
-            </w:r>
-            <w:r>
-              <w:t xml:space="preserve">been </w:t>
+              <w:t xml:space="preserve">This issue has been </w:t>
             </w:r>
             <w:r>
               <w:t xml:space="preserve">addressed as an important issue to </w:t>
@@ -572,10 +567,19 @@
       <w:r>
         <w:t xml:space="preserve">3. </w:t>
       </w:r>
+      <w:r>
+        <w:t xml:space="preserve">What information is required </w:t>
+      </w:r>
+      <w:r>
+        <w:t>in</w:t>
+      </w:r>
+      <w:r>
+        <w:t xml:space="preserve"> the Operational Reports?</w:t>
+      </w:r>
     </w:p>
     <w:p>
       <w:r>
-        <w:t>4. ______________________________________________________________</w:t>
+        <w:t xml:space="preserve">4. </w:t>
       </w:r>
     </w:p>
     <w:p>
@@ -593,17 +597,26 @@
     </w:p>
     <w:p>
       <w:r>
-        <w:t>1. ______________________________________________________________</w:t>
+        <w:t xml:space="preserve">1. </w:t>
+      </w:r>
+      <w:r>
+        <w:t>The extent of information stored within the Records and History Management subsystem</w:t>
       </w:r>
     </w:p>
     <w:p>
       <w:r>
-        <w:t>2. ______________________________________________________________</w:t>
+        <w:t xml:space="preserve">2. </w:t>
+      </w:r>
+      <w:r>
+        <w:t>The information placed in the Operational Report</w:t>
       </w:r>
     </w:p>
     <w:p>
       <w:r>
-        <w:t>3. ______________________________________________________________</w:t>
+        <w:t xml:space="preserve">3. </w:t>
+      </w:r>
+      <w:r>
+        <w:t>How the appointment scheduling system would function.</w:t>
       </w:r>
     </w:p>
     <w:p>
@@ -634,6 +647,20 @@
       </w:r>
     </w:p>
     <w:p>
+      <w:r>
+        <w:t xml:space="preserve">The code </w:t>
+      </w:r>
+      <w:r>
+        <w:t>stores data</w:t>
+      </w:r>
+      <w:r>
+        <w:t xml:space="preserve"> for patients, practitioners, and appointment schedules to be accessed easily. </w:t>
+      </w:r>
+      <w:r>
+        <w:t xml:space="preserve">This could cause a number of issues, including loss of information if improperly stored, </w:t>
+      </w:r>
+    </w:p>
+    <w:p>
       <w:pPr>
         <w:pStyle w:val="Heading2"/>
       </w:pPr>
@@ -643,34 +670,16 @@
     </w:p>
     <w:p>
       <w:r>
-        <w:t xml:space="preserve">Act as a tutor. Explain this code and identify potential problems. Do not provide a complete replacement. Ask me questions that help </w:t>
-      </w:r>
-      <w:proofErr w:type="gramStart"/>
-      <w:r>
-        <w:t>me</w:t>
-      </w:r>
-      <w:proofErr w:type="gramEnd"/>
-      <w:r>
-        <w:t xml:space="preserve"> reason </w:t>
-      </w:r>
-      <w:proofErr w:type="gramStart"/>
-      <w:r>
-        <w:t>about</w:t>
-      </w:r>
-      <w:proofErr w:type="gramEnd"/>
-      <w:r>
-        <w:t xml:space="preserve"> the solution.</w:t>
+        <w:t>Act as a tutor. Explain this code and identify potential problems. Do not provide a complete replacement. Ask me questions that help me reason about the solution.</w:t>
       </w:r>
     </w:p>
     <w:p>
       <w:pPr>
         <w:pStyle w:val="Heading2"/>
       </w:pPr>
-      <w:proofErr w:type="gramStart"/>
       <w:r>
         <w:t>Evaluate</w:t>
       </w:r>
-      <w:proofErr w:type="gramEnd"/>
     </w:p>
     <w:tbl>
       <w:tblPr>

</xml_diff>